<commit_message>
Fix Word document formatting, remove justification gaps, and update screenshots for Parth Oza
</commit_message>
<xml_diff>
--- a/pract-10-awdf-24cs055.docx
+++ b/pract-10-awdf-24cs055.docx
@@ -525,7 +525,7 @@
           <w:tab w:val="left" w:pos="3375"/>
         </w:tabs>
         <w:ind w:right="450"/>
-        <w:jc w:val="both"/>
+        <w:jc w:val="left"/>
         <w:rPr>
           <w:rFonts w:ascii="Times New Roman" w:hAnsi="Times New Roman" w:eastAsia="Times New Roman" w:cs="Times New Roman"/>
           <w:sz w:val="24"/>
@@ -662,7 +662,7 @@
           </w:tcPr>
           <w:p>
             <w:pPr>
-              <w:jc w:val="both"/>
+              <w:jc w:val="left"/>
             </w:pPr>
             <w:r>
               <w:rPr>
@@ -722,7 +722,6 @@
                 <w:b/>
                 <w:sz w:val="21"/>
               </w:rPr>
-              <w:br w:type="textWrapping"/>
             </w:r>
             <w:r>
               <w:rPr>
@@ -850,7 +849,6 @@
                 <w:b/>
                 <w:sz w:val="22"/>
               </w:rPr>
-              <w:br/>
             </w:r>
             <w:r>
               <w:rPr>
@@ -887,7 +885,6 @@
                 <w:b/>
                 <w:sz w:val="22"/>
               </w:rPr>
-              <w:br/>
             </w:r>
             <w:r>
               <w:rPr>
@@ -924,7 +921,6 @@
                 <w:b/>
                 <w:sz w:val="22"/>
               </w:rPr>
-              <w:br/>
             </w:r>
             <w:r>
               <w:rPr>
@@ -961,7 +957,6 @@
                 <w:b/>
                 <w:sz w:val="22"/>
               </w:rPr>
-              <w:br/>
             </w:r>
             <w:r>
               <w:rPr>
@@ -998,7 +993,6 @@
                 <w:b/>
                 <w:sz w:val="22"/>
               </w:rPr>
-              <w:br/>
             </w:r>
             <w:r>
               <w:rPr>
@@ -1035,7 +1029,6 @@
                 <w:b/>
                 <w:sz w:val="22"/>
               </w:rPr>
-              <w:br/>
             </w:r>
             <w:r>
               <w:rPr>
@@ -1072,7 +1065,6 @@
                 <w:b/>
                 <w:sz w:val="22"/>
               </w:rPr>
-              <w:br/>
             </w:r>
             <w:r>
               <w:rPr>
@@ -1109,7 +1101,6 @@
                 <w:b/>
                 <w:sz w:val="22"/>
               </w:rPr>
-              <w:br/>
             </w:r>
             <w:r>
               <w:rPr>
@@ -1502,7 +1493,7 @@
           <w:tab w:val="left" w:pos="3375"/>
         </w:tabs>
         <w:ind w:right="450"/>
-        <w:jc w:val="both"/>
+        <w:jc w:val="left"/>
         <w:rPr>
           <w:rFonts w:ascii="Times New Roman" w:hAnsi="Times New Roman" w:eastAsia="Times New Roman" w:cs="Times New Roman"/>
           <w:sz w:val="24"/>
@@ -1556,7 +1547,7 @@
           <w:tab w:val="left" w:pos="3375"/>
         </w:tabs>
         <w:ind w:right="450"/>
-        <w:jc w:val="both"/>
+        <w:jc w:val="left"/>
         <w:rPr>
           <w:rFonts w:ascii="Times New Roman" w:hAnsi="Times New Roman" w:eastAsia="Times New Roman" w:cs="Times New Roman"/>
           <w:sz w:val="24"/>

</xml_diff>